<commit_message>
feat(model): Submit v2 as TEAM_01 by team decision
v2 failed the pre-registered gate on ABIDES max drawdown but beats v1 on
most rubric averages; the team chose it and the deviation is recorded in
EXPERIMENTS.md. Rebuild v2 by default in build_final (v1 via --v1),
re-export the validated ZIP, and update the docs, diagram and prompt.

Co-Authored-By: Claude Opus 5.5 <noreply@anthropic.com>
</commit_message>
<xml_diff>
--- a/student_work/Explicacion_modelo_TEAM_01.docx
+++ b/student_work/Explicacion_modelo_TEAM_01.docx
@@ -656,12 +656,12 @@
         <w:pStyle w:val="Heading1"/>
       </w:pPr>
       <w:r>
-        <w:t>4. Por qué elegimos el modelo final</w:t>
+        <w:t>4. Por qué elegimos v1 en la primera etapa</w:t>
       </w:r>
     </w:p>
     <w:p>
       <w:r>
-        <w:t>Elegimos un ensamble de 7 DQN con la capa de seguridad. Las razones:</w:t>
+        <w:t>Al final de la primera etapa elegimos un ensamble de 7 DQN con la capa de seguridad (v1). La segunda etapa (secciones 8 y 9) lo mejoró hasta v2, que es el modelo entregado. Las razones para elegir v1 fueron:</w:t>
       </w:r>
     </w:p>
     <w:p>
@@ -1463,7 +1463,7 @@
         <w:pStyle w:val="Heading1"/>
       </w:pPr>
       <w:r>
-        <w:t>5. Qué hace el modelo, paso a paso</w:t>
+        <w:t>5. Qué hace el modelo entregado (v2), paso a paso</w:t>
       </w:r>
     </w:p>
     <w:p>
@@ -1488,10 +1488,24 @@
         <w:rPr>
           <w:b/>
         </w:rPr>
-        <w:t xml:space="preserve">Siete redes neuronales (16→64→64→9) </w:t>
+        <w:t xml:space="preserve">Neutraliza los datos del libro de órdenes. </w:t>
       </w:r>
       <w:r>
-        <w:t>estiman el valor (Q) de cada una de las 9 acciones, y se promedian. Así se reduce el error de cualquier red individual.</w:t>
+        <w:t>A las redes les llega desequilibrio 0 y profundidad media de práctica, porque en ABIDES esos valores están fuera de lo que vieron al entrenar. La capa de seguridad sí ve los datos reales.</w:t>
+      </w:r>
+    </w:p>
+    <w:p>
+      <w:pPr>
+        <w:pStyle w:val="ListNumber"/>
+      </w:pPr>
+      <w:r>
+        <w:rPr>
+          <w:b/>
+        </w:rPr>
+        <w:t xml:space="preserve">Nueve redes neuronales (16→64→64→9) </w:t>
+      </w:r>
+      <w:r>
+        <w:t>estiman el valor (Q) de cada una de las 9 acciones, y se promedian: las 7 de v1 más 2 nuevas elegidas en la segunda etapa.</w:t>
       </w:r>
     </w:p>
     <w:p>
@@ -1505,7 +1519,7 @@
         <w:t xml:space="preserve">La capa de seguridad anula las acciones que </w:t>
       </w:r>
       <w:r>
-        <w:t>superarían 400 acciones de inventario, llevarían la exposición a más del 30 % del patrimonio, aumentarían la posición estando en −5 % (en ese caso obliga a reducirla) o abrirían posición con el libro roto.</w:t>
+        <w:t>superarían 400 acciones de inventario, llevarían la exposición a más del 30 % del patrimonio, aumentarían la posición estando en −5 % (en ese caso obliga a reducirla), abrirían posición con el libro roto o añadirían una orden grande mientras hay otras en espera.</w:t>
       </w:r>
     </w:p>
     <w:p>
@@ -1520,6 +1534,42 @@
       </w:r>
       <w:r>
         <w:t>siempre válida.</w:t>
+      </w:r>
+    </w:p>
+    <w:p>
+      <w:r>
+        <w:drawing>
+          <wp:inline xmlns:a="http://schemas.openxmlformats.org/drawingml/2006/main" xmlns:pic="http://schemas.openxmlformats.org/drawingml/2006/picture">
+            <wp:extent cx="5760720" cy="1991480"/>
+            <wp:docPr id="1" name="Picture 1"/>
+            <wp:cNvGraphicFramePr>
+              <a:graphicFrameLocks noChangeAspect="1"/>
+            </wp:cNvGraphicFramePr>
+            <a:graphic>
+              <a:graphicData uri="http://schemas.openxmlformats.org/drawingml/2006/picture">
+                <pic:pic>
+                  <pic:nvPicPr>
+                    <pic:cNvPr id="0" name="fig5_como_decide.png"/>
+                    <pic:cNvPicPr/>
+                  </pic:nvPicPr>
+                  <pic:blipFill>
+                    <a:blip r:embed="rId9"/>
+                    <a:stretch>
+                      <a:fillRect/>
+                    </a:stretch>
+                  </pic:blipFill>
+                  <pic:spPr>
+                    <a:xfrm>
+                      <a:off x="0" y="0"/>
+                      <a:ext cx="5760720" cy="1991480"/>
+                    </a:xfrm>
+                    <a:prstGeom prst="rect"/>
+                  </pic:spPr>
+                </pic:pic>
+              </a:graphicData>
+            </a:graphic>
+          </wp:inline>
+        </w:drawing>
       </w:r>
     </w:p>
     <w:p>
@@ -1575,6 +1625,20 @@
       </w:r>
       <w:r>
         <w:t>cómo mide la profundidad, cada cuánto actúa el agente y la escala de precios.</w:t>
+      </w:r>
+    </w:p>
+    <w:p>
+      <w:pPr>
+        <w:pStyle w:val="ListBullet"/>
+      </w:pPr>
+      <w:r>
+        <w:rPr>
+          <w:b/>
+        </w:rPr>
+        <w:t xml:space="preserve">El freno de pérdidas sigue siendo un punto débil: </w:t>
+      </w:r>
+      <w:r>
+        <w:t>con el libro vacío, la orden a mercado que obliga a cerrar la posición puede ejecutarse a un precio absurdo. Le pasó una vez a v2 (−126 %) y una vez a v1 (−97 %) en la prueba final.</w:t>
       </w:r>
     </w:p>
     <w:p>
@@ -1814,7 +1878,7 @@
         <w:drawing>
           <wp:inline xmlns:a="http://schemas.openxmlformats.org/drawingml/2006/main" xmlns:pic="http://schemas.openxmlformats.org/drawingml/2006/picture">
             <wp:extent cx="5760720" cy="2050605"/>
-            <wp:docPr id="1" name="Picture 1"/>
+            <wp:docPr id="2" name="Picture 2"/>
             <wp:cNvGraphicFramePr>
               <a:graphicFrameLocks noChangeAspect="1"/>
             </wp:cNvGraphicFramePr>
@@ -1826,7 +1890,7 @@
                     <pic:cNvPicPr/>
                   </pic:nvPicPr>
                   <pic:blipFill>
-                    <a:blip r:embed="rId9"/>
+                    <a:blip r:embed="rId10"/>
                     <a:stretch>
                       <a:fillRect/>
                     </a:stretch>
@@ -2192,7 +2256,7 @@
         <w:drawing>
           <wp:inline xmlns:a="http://schemas.openxmlformats.org/drawingml/2006/main" xmlns:pic="http://schemas.openxmlformats.org/drawingml/2006/picture">
             <wp:extent cx="5760720" cy="2906785"/>
-            <wp:docPr id="2" name="Picture 2"/>
+            <wp:docPr id="3" name="Picture 3"/>
             <wp:cNvGraphicFramePr>
               <a:graphicFrameLocks noChangeAspect="1"/>
             </wp:cNvGraphicFramePr>
@@ -2204,7 +2268,7 @@
                     <pic:cNvPicPr/>
                   </pic:nvPicPr>
                   <pic:blipFill>
-                    <a:blip r:embed="rId10"/>
+                    <a:blip r:embed="rId11"/>
                     <a:stretch>
                       <a:fillRect/>
                     </a:stretch>
@@ -2228,7 +2292,7 @@
         <w:drawing>
           <wp:inline xmlns:a="http://schemas.openxmlformats.org/drawingml/2006/main" xmlns:pic="http://schemas.openxmlformats.org/drawingml/2006/picture">
             <wp:extent cx="5029200" cy="3185663"/>
-            <wp:docPr id="3" name="Picture 3"/>
+            <wp:docPr id="4" name="Picture 4"/>
             <wp:cNvGraphicFramePr>
               <a:graphicFrameLocks noChangeAspect="1"/>
             </wp:cNvGraphicFramePr>
@@ -2240,7 +2304,7 @@
                     <pic:cNvPicPr/>
                   </pic:nvPicPr>
                   <pic:blipFill>
-                    <a:blip r:embed="rId11"/>
+                    <a:blip r:embed="rId12"/>
                     <a:stretch>
                       <a:fillRect/>
                     </a:stretch>
@@ -2264,10 +2328,10 @@
         <w:rPr>
           <w:b/>
         </w:rPr>
-        <w:t xml:space="preserve">Decisión: </w:t>
+        <w:t xml:space="preserve">Resultado de la prueba: </w:t>
       </w:r>
       <w:r>
-        <w:t>v2 no pasó la prueba: en una sola simulación (volátil + momentum) perdió un −126 %. Por eso el modelo entregado sigue siendo v1 (TEAM_01.zip no cambia). Respetamos la regla aunque v2 sea mejor en casi todas las medias, porque elegir después de ver el resultado sería hacer trampa con nuestra propia prueba.</w:t>
+        <w:t>v2 no cumplió una de las condiciones: en una sola simulación (volátil + momentum) perdió un −126 %, más que la peor caída de v1 (−98 %).</w:t>
       </w:r>
     </w:p>
     <w:p>
@@ -2275,10 +2339,32 @@
         <w:rPr>
           <w:b/>
         </w:rPr>
-        <w:t xml:space="preserve">Por qué falló: </w:t>
+        <w:t xml:space="preserve">Decisión del equipo: </w:t>
       </w:r>
       <w:r>
-        <w:t>en esa simulación el libro de órdenes se vació (spread de 87 $). El freno de pérdidas obliga a cerrar la posición con una orden a mercado, y sin contrapartida esa orden se ejecuta a precios absurdos. v1 tiene el mismo punto débil (−97 % con presión compradora). El siguiente paso sería que el freno espere (HOLD) mientras el libro está roto, y probarlo con semillas nuevas.</w:t>
+        <w:t>aun así, el equipo decidió entregar v2. Es mejor que v1 en casi todo lo que puntúa la rúbrica: más rentabilidad en ABIDES (+3,25 % frente a +0,60 %), más rentabilidad y más simulaciones con ganancia en el mercado compartido (+3,31 % frente a +0,75 %; 73 % frente a 50 %), menos simulaciones con caídas de más del 20 % (3,6 % frente a 5,5 %) y menor caída en el mercado de práctica. TEAM_01.zip contiene ahora v2 y el validador lo da por VÁLIDO; v1 queda guardado como copia de seguridad.</w:t>
+      </w:r>
+    </w:p>
+    <w:p>
+      <w:r>
+        <w:rPr>
+          <w:b/>
+        </w:rPr>
+        <w:t xml:space="preserve">Transparencia: </w:t>
+      </w:r>
+      <w:r>
+        <w:t>esta decisión se aparta de la regla que fijamos antes de la prueba, y lo dejamos registrado. La regla protegía contra el riesgo de un episodio catastrófico, y ese riesgo sigue existiendo: el drawdown máximo es un 20 % de la nota. Además, la condición de práctica solo se cumplió por empate exacto, después de cambiar "mejor que v1" por "igual o mejor que v1" antes de la prueba.</w:t>
+      </w:r>
+    </w:p>
+    <w:p>
+      <w:r>
+        <w:rPr>
+          <w:b/>
+        </w:rPr>
+        <w:t xml:space="preserve">Por qué falló esa simulación: </w:t>
+      </w:r>
+      <w:r>
+        <w:t>en esa simulación el libro de órdenes se vació (spread de 87 $). El freno de pérdidas obliga a cerrar la posición con una orden a mercado, y sin contrapartida esa orden se ejecuta a precios absurdos. v1 tiene el mismo punto débil (−97 % con presión compradora). La mejora pendiente es que el freno espere (HOLD) mientras el libro está roto, y probarla con semillas nuevas.</w:t>
       </w:r>
     </w:p>
     <w:p>
@@ -2289,7 +2375,7 @@
         <w:t xml:space="preserve">Lo que aprendimos: </w:t>
       </w:r>
       <w:r>
-        <w:t>una prueba previa y honesta puede rechazar un modelo que parece mejor. El drawdown máximo es un 20 % de la nota y un solo episodio catastrófico pesa mucho, así que preferimos el modelo cuyo peor caso ya conocemos.</w:t>
+        <w:t>las medias y los peores casos pueden apuntar a modelos distintos. Fijar las reglas antes de la prueba nos obligó a ver ese conflicto con claridad y a tomar la decisión de forma consciente y documentada.</w:t>
       </w:r>
     </w:p>
     <w:sectPr>

</xml_diff>